<commit_message>
P1-14 short comparison windows labeled low confidence on card and memo
Every comparison whose effective window is shorter than three years
carries "low confidence: N-year window, shorter than 3 years" beside the
window on the benchmark card (chip) and as a sentence in the memo. Today
that is sreit (one year) and kkr_kpec (2.33 years against PSP, two fiscal
years against its cohort). The threshold is one constant in the engine.
Gates: sreit and kkr_kpec labeled, cliffwater_cclfx not, the label
rendered on the sreit card and absent on cclfx's. Also carries the
DECISIONS 6.7 entry for P1-13 and 6.8 for this task.

Co-Authored-By: Claude Fable 5.1 <noreply@anthropic.com>
Claude-Session: https://claude.ai/code/session_01FULUeLzMZ3vNfQeUL5L4Hg
</commit_message>
<xml_diff>
--- a/data/memos/kkr_kpec_decision_memo.docx
+++ b/data/memos/kkr_kpec_decision_memo.docx
@@ -276,7 +276,7 @@
     </w:p>
     <w:p>
       <w:r>
-        <w:t>Window 2023-09-01 to 2025-12-31: fund 12.94%/yr vs benchmark 18.36%/yr, KS-PME 0.8964, Direct Alpha -4.58%/yr. Disclosure: PME and alpha computed on appraisal-lagged NAVs are window-sensitive and can be smoothing-flattered. Conclusions should be read with the methodology's window-sensitivity analysis.</w:t>
+        <w:t>Window 2023-09-01 to 2025-12-31: fund 12.94%/yr vs benchmark 18.36%/yr, KS-PME 0.8964, Direct Alpha -4.58%/yr. Disclosure: PME and alpha computed on appraisal-lagged NAVs are window-sensitive and can be smoothing-flattered. Conclusions should be read with the methodology's window-sensitivity analysis. Low confidence: 2.33-year window, shorter than 3 years.</w:t>
       </w:r>
     </w:p>
     <w:p>
@@ -334,7 +334,7 @@
     </w:p>
     <w:p>
       <w:r>
-        <w:t>Window FY2024 to FY2025 (2 overlapping fiscal year(s) of 5 composite years): fund 13.95%/yr vs benchmark 13.61%/yr, KS-PME 1.0059, Direct Alpha 0.29%/yr. Disclosure: PME and alpha computed on appraisal-lagged NAVs are window-sensitive and can be smoothing-flattered. Conclusions should be read with the methodology's window-sensitivity analysis.</w:t>
+        <w:t>Window FY2024 to FY2025 (2 overlapping fiscal year(s) of 5 composite years): fund 13.95%/yr vs benchmark 13.61%/yr, KS-PME 1.0059, Direct Alpha 0.29%/yr. Disclosure: PME and alpha computed on appraisal-lagged NAVs are window-sensitive and can be smoothing-flattered. Conclusions should be read with the methodology's window-sensitivity analysis. Low confidence: 2-fiscal-year window, shorter than 3 years.</w:t>
       </w:r>
     </w:p>
     <w:p>

</xml_diff>